<commit_message>
Update CBase Description method and Related Class.
</commit_message>
<xml_diff>
--- a/Experts/Anhnt/Document/MQL5 Note/2026 0407 MVC Library.docx
+++ b/Experts/Anhnt/Document/MQL5 Note/2026 0407 MVC Library.docx
@@ -3,6 +3,14 @@
 <w:document xmlns:wpc="http://schemas.microsoft.com/office/word/2010/wordprocessingCanvas" xmlns:cx="http://schemas.microsoft.com/office/drawing/2014/chartex" xmlns:cx1="http://schemas.microsoft.com/office/drawing/2015/9/8/chartex" xmlns:cx2="http://schemas.microsoft.com/office/drawing/2015/10/21/chartex" xmlns:cx3="http://schemas.microsoft.com/office/drawing/2016/5/9/chartex" xmlns:cx4="http://schemas.microsoft.com/office/drawing/2016/5/10/chartex" xmlns:cx5="http://schemas.microsoft.com/office/drawing/2016/5/11/chartex" xmlns:cx6="http://schemas.microsoft.com/office/drawing/2016/5/12/chartex" xmlns:cx7="http://schemas.microsoft.com/office/drawing/2016/5/13/chartex" xmlns:cx8="http://schemas.microsoft.com/office/drawing/2016/5/14/chartex" xmlns:mc="http://schemas.openxmlformats.org/markup-compatibility/2006" xmlns:aink="http://schemas.microsoft.com/office/drawing/2016/ink" xmlns:am3d="http://schemas.microsoft.com/office/drawing/2017/model3d" xmlns:o="urn:schemas-microsoft-com:office:office" xmlns:oel="http://schemas.microsoft.com/office/2019/extlst" xmlns:r="http://schemas.openxmlformats.org/officeDocument/2006/relationships" xmlns:m="http://schemas.openxmlformats.org/officeDocument/2006/math" xmlns:v="urn:schemas-microsoft-com:vml" xmlns:wp14="http://schemas.microsoft.com/office/word/2010/wordprocessingDrawing" xmlns:wp="http://schemas.openxmlformats.org/drawingml/2006/wordprocessingDrawing" xmlns:w10="urn:schemas-microsoft-com:office:word" xmlns:w="http://schemas.openxmlformats.org/wordprocessingml/2006/main" xmlns:w14="http://schemas.microsoft.com/office/word/2010/wordml" xmlns:w15="http://schemas.microsoft.com/office/word/2012/wordml" xmlns:w16cex="http://schemas.microsoft.com/office/word/2018/wordml/cex" xmlns:w16cid="http://schemas.microsoft.com/office/word/2016/wordml/cid" xmlns:w16="http://schemas.microsoft.com/office/word/2018/wordml" xmlns:w16du="http://schemas.microsoft.com/office/word/2023/wordml/word16du" xmlns:w16sdtdh="http://schemas.microsoft.com/office/word/2020/wordml/sdtdatahash" xmlns:w16sdtfl="http://schemas.microsoft.com/office/word/2024/wordml/sdtformatlock" xmlns:w16se="http://schemas.microsoft.com/office/word/2015/wordml/symex" xmlns:wpg="http://schemas.microsoft.com/office/word/2010/wordprocessingGroup" xmlns:wpi="http://schemas.microsoft.com/office/word/2010/wordprocessingInk" xmlns:wne="http://schemas.microsoft.com/office/word/2006/wordml" xmlns:wps="http://schemas.microsoft.com/office/word/2010/wordprocessingShape" mc:Ignorable="w14 w15 w16se w16cid w16 w16cex w16sdtdh w16sdtfl w16du wp14">
   <w:body>
     <w:p>
+      <w:pPr>
+        <w:pStyle w:val="Heading1"/>
+      </w:pPr>
+      <w:r>
+        <w:t>Refactor 1</w:t>
+      </w:r>
+    </w:p>
+    <w:p>
       <w:proofErr w:type="spellStart"/>
       <w:r>
         <w:t>Tác</w:t>
@@ -32,19 +40,7 @@
           <w:rPr>
             <w:rStyle w:val="Hyperlink"/>
           </w:rPr>
-          <w:t>https://www.mql5.com/en/users/artmed</w:t>
-        </w:r>
-        <w:r>
-          <w:rPr>
-            <w:rStyle w:val="Hyperlink"/>
-          </w:rPr>
-          <w:t>i</w:t>
-        </w:r>
-        <w:r>
-          <w:rPr>
-            <w:rStyle w:val="Hyperlink"/>
-          </w:rPr>
-          <w:t>a70</w:t>
+          <w:t>https://www.mql5.com/en/users/artmedia70</w:t>
         </w:r>
       </w:hyperlink>
     </w:p>
@@ -183,11 +179,28 @@
       <w:r>
         <w:t xml:space="preserve"> </w:t>
       </w:r>
-      <w:r>
-        <w:t>https://www.mql5.com/en/articles/14479</w:t>
-      </w:r>
+      <w:hyperlink r:id="rId7" w:history="1">
+        <w:r>
+          <w:rPr>
+            <w:rStyle w:val="Hyperlink"/>
+          </w:rPr>
+          <w:t>https://www.mql5.com/en/articles/14479</w:t>
+        </w:r>
+      </w:hyperlink>
     </w:p>
     <w:p>
+      <w:r>
+        <w:rPr>
+          <w:rStyle w:val="Heading2Char"/>
+        </w:rPr>
+        <w:t>Series 4: MVC paradigm</w:t>
+      </w:r>
+      <w:r>
+        <w:t xml:space="preserve"> </w:t>
+      </w:r>
+      <w:r>
+        <w:br/>
+      </w:r>
       <w:r>
         <w:t xml:space="preserve">Series 4: </w:t>
       </w:r>
@@ -240,13 +253,7 @@
         <w:ind w:left="720"/>
       </w:pPr>
       <w:r>
-        <w:t>1</w:t>
-      </w:r>
-      <w:r>
-        <w:t xml:space="preserve">. </w:t>
-      </w:r>
-      <w:r>
-        <w:t>17653 Applying the MVC concept</w:t>
+        <w:t>1. 17653 Applying the MVC concept</w:t>
       </w:r>
     </w:p>
     <w:p>
@@ -254,13 +261,7 @@
         <w:ind w:left="720"/>
       </w:pPr>
       <w:r>
-        <w:t>2</w:t>
-      </w:r>
-      <w:r>
-        <w:t xml:space="preserve">. </w:t>
-      </w:r>
-      <w:r>
-        <w:t>17960 Base graphical element</w:t>
+        <w:t>2. 17960 Base graphical element</w:t>
       </w:r>
     </w:p>
     <w:p>
@@ -268,13 +269,7 @@
         <w:ind w:left="720"/>
       </w:pPr>
       <w:r>
-        <w:t>3</w:t>
-      </w:r>
-      <w:r>
-        <w:t xml:space="preserve">. </w:t>
-      </w:r>
-      <w:r>
-        <w:t>18221 Simple controls</w:t>
+        <w:t>3. 18221 Simple controls</w:t>
       </w:r>
     </w:p>
     <w:p>
@@ -282,13 +277,7 @@
         <w:ind w:left="720"/>
       </w:pPr>
       <w:r>
-        <w:t>4</w:t>
-      </w:r>
-      <w:r>
-        <w:t xml:space="preserve">. </w:t>
-      </w:r>
-      <w:r>
-        <w:t>18658 Containers</w:t>
+        <w:t>4. 18658 Containers</w:t>
       </w:r>
     </w:p>
     <w:p>
@@ -296,13 +285,7 @@
         <w:ind w:left="720"/>
       </w:pPr>
       <w:r>
-        <w:t>5</w:t>
-      </w:r>
-      <w:r>
-        <w:t xml:space="preserve">. </w:t>
-      </w:r>
-      <w:r>
-        <w:t>18941 Resizable elements</w:t>
+        <w:t>5. 18941 Resizable elements</w:t>
       </w:r>
     </w:p>
     <w:p>
@@ -310,13 +293,7 @@
         <w:ind w:left="720"/>
       </w:pPr>
       <w:r>
-        <w:t>6</w:t>
-      </w:r>
-      <w:r>
-        <w:t xml:space="preserve">. </w:t>
-      </w:r>
-      <w:r>
-        <w:t>19288 Integrating the Model Component into the View Component</w:t>
+        <w:t>6. 19288 Integrating the Model Component into the View Component</w:t>
       </w:r>
     </w:p>
     <w:p>
@@ -324,13 +301,7 @@
         <w:ind w:left="720"/>
       </w:pPr>
       <w:r>
-        <w:t>7</w:t>
-      </w:r>
-      <w:r>
-        <w:t xml:space="preserve">. </w:t>
-      </w:r>
-      <w:r>
-        <w:t>19979 Customizable and sortable table columns</w:t>
+        <w:t>7. 19979 Customizable and sortable table columns</w:t>
       </w:r>
     </w:p>
     <w:p>
@@ -338,16 +309,7 @@
         <w:ind w:left="720"/>
       </w:pPr>
       <w:r>
-        <w:t>8</w:t>
-      </w:r>
-      <w:r>
-        <w:t xml:space="preserve">. </w:t>
-      </w:r>
-      <w:r>
-        <w:t>20596 Symbol Correlation Table</w:t>
-      </w:r>
-      <w:r>
-        <w:t xml:space="preserve"> </w:t>
+        <w:t xml:space="preserve">8. 20596 Symbol Correlation Table </w:t>
       </w:r>
       <w:r>
         <w:t>https://www.mql5.com/ru/articles/20596</w:t>
@@ -468,6 +430,17 @@
       <w:proofErr w:type="spellEnd"/>
       <w:r>
         <w:t>.</w:t>
+      </w:r>
+    </w:p>
+    <w:p>
+      <w:pPr>
+        <w:pStyle w:val="Heading2"/>
+      </w:pPr>
+      <w:r>
+        <w:t xml:space="preserve">Refactor </w:t>
+      </w:r>
+      <w:r>
+        <w:t>MVC paradigm</w:t>
       </w:r>
     </w:p>
     <w:p>
@@ -626,6 +599,7 @@
     </w:p>
     <w:p>
       <w:r>
+        <w:lastRenderedPageBreak/>
         <w:t xml:space="preserve">Tất </w:t>
       </w:r>
       <w:proofErr w:type="spellStart"/>
@@ -793,7 +767,6 @@
       </w:pPr>
       <w:proofErr w:type="spellStart"/>
       <w:r>
-        <w:lastRenderedPageBreak/>
         <w:t>Control.mqh</w:t>
       </w:r>
       <w:proofErr w:type="spellEnd"/>
@@ -7149,6 +7122,7 @@
                 <w:szCs w:val="22"/>
                 <w14:ligatures w14:val="none"/>
               </w:rPr>
+              <w:lastRenderedPageBreak/>
               <w:t>Controls_EN.mqh</w:t>
             </w:r>
             <w:proofErr w:type="spellEnd"/>
@@ -7949,7 +7923,6 @@
                 <w:szCs w:val="22"/>
                 <w14:ligatures w14:val="none"/>
               </w:rPr>
-              <w:lastRenderedPageBreak/>
               <w:t>Controls_EN.mqh</w:t>
             </w:r>
             <w:proofErr w:type="spellEnd"/>
@@ -12513,6 +12486,619 @@
         </w:tc>
       </w:tr>
     </w:tbl>
+    <w:p/>
+    <w:p>
+      <w:pPr>
+        <w:pStyle w:val="Heading2"/>
+      </w:pPr>
+      <w:proofErr w:type="spellStart"/>
+      <w:r>
+        <w:t>Kiến</w:t>
+      </w:r>
+      <w:proofErr w:type="spellEnd"/>
+      <w:r>
+        <w:t xml:space="preserve"> </w:t>
+      </w:r>
+      <w:proofErr w:type="spellStart"/>
+      <w:r>
+        <w:t>trúc</w:t>
+      </w:r>
+      <w:proofErr w:type="spellEnd"/>
+      <w:r>
+        <w:t xml:space="preserve"> EA.</w:t>
+      </w:r>
+    </w:p>
+    <w:p>
+      <w:r>
+        <w:t xml:space="preserve">EA.mq5 → </w:t>
+      </w:r>
+      <w:proofErr w:type="spellStart"/>
+      <w:r>
+        <w:t>Program.mqh</w:t>
+      </w:r>
+      <w:proofErr w:type="spellEnd"/>
+      <w:r>
+        <w:t xml:space="preserve"> → </w:t>
+      </w:r>
+      <w:proofErr w:type="spellStart"/>
+      <w:r>
+        <w:t>SimpleControl.mqh</w:t>
+      </w:r>
+      <w:proofErr w:type="spellEnd"/>
+      <w:r>
+        <w:t xml:space="preserve"> → Library (20596 Refactor)</w:t>
+      </w:r>
+      <w:r>
+        <w:br/>
+      </w:r>
+      <w:proofErr w:type="spellStart"/>
+      <w:r>
+        <w:t>CLabel</w:t>
+      </w:r>
+      <w:proofErr w:type="spellEnd"/>
+      <w:r>
+        <w:t xml:space="preserve"> → </w:t>
+      </w:r>
+      <w:proofErr w:type="spellStart"/>
+      <w:r>
+        <w:t>CElementBase</w:t>
+      </w:r>
+      <w:proofErr w:type="spellEnd"/>
+      <w:r>
+        <w:t xml:space="preserve"> → </w:t>
+      </w:r>
+      <w:proofErr w:type="spellStart"/>
+      <w:r>
+        <w:t>CCanvasBase</w:t>
+      </w:r>
+      <w:proofErr w:type="spellEnd"/>
+      <w:r>
+        <w:t xml:space="preserve"> → </w:t>
+      </w:r>
+      <w:proofErr w:type="spellStart"/>
+      <w:r>
+        <w:t>CBoundedObj</w:t>
+      </w:r>
+      <w:proofErr w:type="spellEnd"/>
+      <w:r>
+        <w:t xml:space="preserve"> → </w:t>
+      </w:r>
+      <w:proofErr w:type="spellStart"/>
+      <w:r>
+        <w:t>CBaseObj</w:t>
+      </w:r>
+      <w:proofErr w:type="spellEnd"/>
+      <w:r>
+        <w:t xml:space="preserve"> → </w:t>
+      </w:r>
+      <w:proofErr w:type="spellStart"/>
+      <w:r>
+        <w:t>CObject</w:t>
+      </w:r>
+      <w:proofErr w:type="spellEnd"/>
+      <w:r>
+        <w:t xml:space="preserve"> </w:t>
+      </w:r>
+      <w:r>
+        <w:br/>
+      </w:r>
+      <w:proofErr w:type="spellStart"/>
+      <w:r>
+        <w:t>CButton</w:t>
+      </w:r>
+      <w:proofErr w:type="spellEnd"/>
+      <w:r>
+        <w:t xml:space="preserve"> → </w:t>
+      </w:r>
+      <w:proofErr w:type="spellStart"/>
+      <w:r>
+        <w:t>CLabel</w:t>
+      </w:r>
+      <w:proofErr w:type="spellEnd"/>
+      <w:r>
+        <w:t xml:space="preserve"> </w:t>
+      </w:r>
+      <w:proofErr w:type="spellStart"/>
+      <w:r>
+        <w:t>CCheckBox</w:t>
+      </w:r>
+      <w:proofErr w:type="spellEnd"/>
+      <w:r>
+        <w:t xml:space="preserve"> → </w:t>
+      </w:r>
+      <w:proofErr w:type="spellStart"/>
+      <w:r>
+        <w:t>CButtonTriggered</w:t>
+      </w:r>
+      <w:proofErr w:type="spellEnd"/>
+      <w:r>
+        <w:t xml:space="preserve"> → </w:t>
+      </w:r>
+      <w:proofErr w:type="spellStart"/>
+      <w:r>
+        <w:t>CButton</w:t>
+      </w:r>
+      <w:proofErr w:type="spellEnd"/>
+      <w:r>
+        <w:t xml:space="preserve"> </w:t>
+      </w:r>
+      <w:proofErr w:type="spellStart"/>
+      <w:r>
+        <w:t>CRadioButton</w:t>
+      </w:r>
+      <w:proofErr w:type="spellEnd"/>
+      <w:r>
+        <w:t xml:space="preserve"> → </w:t>
+      </w:r>
+      <w:proofErr w:type="spellStart"/>
+      <w:r>
+        <w:t>CCheckBox</w:t>
+      </w:r>
+      <w:proofErr w:type="spellEnd"/>
+    </w:p>
+    <w:p>
+      <w:pPr>
+        <w:rPr>
+          <w:rStyle w:val="Heading2Char"/>
+        </w:rPr>
+        <w:sectPr>
+          <w:pgSz w:w="12240" w:h="15840"/>
+          <w:pgMar w:top="1440" w:right="1440" w:bottom="1440" w:left="1440" w:header="708" w:footer="708" w:gutter="0"/>
+          <w:cols w:space="708"/>
+          <w:docGrid w:linePitch="360"/>
+        </w:sectPr>
+      </w:pPr>
+      <w:r>
+        <w:rPr>
+          <w:rStyle w:val="Heading2Char"/>
+        </w:rPr>
+        <w:br/>
+      </w:r>
+    </w:p>
+    <w:p>
+      <w:r>
+        <w:rPr>
+          <w:b/>
+          <w:bCs/>
+          <w:noProof/>
+          <w:color w:val="00B050"/>
+        </w:rPr>
+        <w:lastRenderedPageBreak/>
+        <w:drawing>
+          <wp:anchor distT="0" distB="0" distL="114300" distR="114300" simplePos="0" relativeHeight="251658240" behindDoc="1" locked="0" layoutInCell="1" allowOverlap="1" wp14:anchorId="3F9CA657" wp14:editId="5A7B4E39">
+            <wp:simplePos x="0" y="0"/>
+            <wp:positionH relativeFrom="column">
+              <wp:posOffset>-7620</wp:posOffset>
+            </wp:positionH>
+            <wp:positionV relativeFrom="paragraph">
+              <wp:posOffset>594360</wp:posOffset>
+            </wp:positionV>
+            <wp:extent cx="5943600" cy="3302000"/>
+            <wp:effectExtent l="0" t="0" r="0" b="0"/>
+            <wp:wrapNone/>
+            <wp:docPr id="934850667" name="Picture 1"/>
+            <wp:cNvGraphicFramePr>
+              <a:graphicFrameLocks xmlns:a="http://schemas.openxmlformats.org/drawingml/2006/main" noChangeAspect="1"/>
+            </wp:cNvGraphicFramePr>
+            <a:graphic xmlns:a="http://schemas.openxmlformats.org/drawingml/2006/main">
+              <a:graphicData uri="http://schemas.openxmlformats.org/drawingml/2006/picture">
+                <pic:pic xmlns:pic="http://schemas.openxmlformats.org/drawingml/2006/picture">
+                  <pic:nvPicPr>
+                    <pic:cNvPr id="934850667" name=""/>
+                    <pic:cNvPicPr/>
+                  </pic:nvPicPr>
+                  <pic:blipFill>
+                    <a:blip r:embed="rId8" cstate="print">
+                      <a:extLst>
+                        <a:ext uri="{28A0092B-C50C-407E-A947-70E740481C1C}">
+                          <a14:useLocalDpi xmlns:a14="http://schemas.microsoft.com/office/drawing/2010/main" val="0"/>
+                        </a:ext>
+                      </a:extLst>
+                    </a:blip>
+                    <a:stretch>
+                      <a:fillRect/>
+                    </a:stretch>
+                  </pic:blipFill>
+                  <pic:spPr>
+                    <a:xfrm>
+                      <a:off x="0" y="0"/>
+                      <a:ext cx="5943600" cy="3302000"/>
+                    </a:xfrm>
+                    <a:prstGeom prst="rect">
+                      <a:avLst/>
+                    </a:prstGeom>
+                  </pic:spPr>
+                </pic:pic>
+              </a:graphicData>
+            </a:graphic>
+          </wp:anchor>
+        </w:drawing>
+      </w:r>
+      <w:proofErr w:type="spellStart"/>
+      <w:r>
+        <w:rPr>
+          <w:rStyle w:val="Heading2Char"/>
+        </w:rPr>
+        <w:t>Mục</w:t>
+      </w:r>
+      <w:proofErr w:type="spellEnd"/>
+      <w:r>
+        <w:rPr>
+          <w:rStyle w:val="Heading2Char"/>
+        </w:rPr>
+        <w:t xml:space="preserve"> </w:t>
+      </w:r>
+      <w:proofErr w:type="spellStart"/>
+      <w:r>
+        <w:rPr>
+          <w:rStyle w:val="Heading2Char"/>
+        </w:rPr>
+        <w:t>tiêu</w:t>
+      </w:r>
+      <w:proofErr w:type="spellEnd"/>
+      <w:r>
+        <w:rPr>
+          <w:rStyle w:val="Heading2Char"/>
+        </w:rPr>
+        <w:t xml:space="preserve"> </w:t>
+      </w:r>
+      <w:proofErr w:type="spellStart"/>
+      <w:r>
+        <w:rPr>
+          <w:rStyle w:val="Heading2Char"/>
+        </w:rPr>
+        <w:t>mong</w:t>
+      </w:r>
+      <w:proofErr w:type="spellEnd"/>
+      <w:r>
+        <w:rPr>
+          <w:rStyle w:val="Heading2Char"/>
+        </w:rPr>
+        <w:t xml:space="preserve"> </w:t>
+      </w:r>
+      <w:proofErr w:type="spellStart"/>
+      <w:r>
+        <w:rPr>
+          <w:rStyle w:val="Heading2Char"/>
+        </w:rPr>
+        <w:t>muốn</w:t>
+      </w:r>
+      <w:proofErr w:type="spellEnd"/>
+      <w:r>
+        <w:br/>
+        <w:t xml:space="preserve"> Là </w:t>
+      </w:r>
+      <w:proofErr w:type="spellStart"/>
+      <w:r>
+        <w:t>giao</w:t>
+      </w:r>
+      <w:proofErr w:type="spellEnd"/>
+      <w:r>
+        <w:t xml:space="preserve"> </w:t>
+      </w:r>
+      <w:proofErr w:type="spellStart"/>
+      <w:r>
+        <w:t>diện</w:t>
+      </w:r>
+      <w:proofErr w:type="spellEnd"/>
+      <w:r>
+        <w:t xml:space="preserve"> </w:t>
+      </w:r>
+      <w:proofErr w:type="spellStart"/>
+      <w:r>
+        <w:t>Giống</w:t>
+      </w:r>
+      <w:proofErr w:type="spellEnd"/>
+      <w:r>
+        <w:t xml:space="preserve"> </w:t>
+      </w:r>
+      <w:proofErr w:type="spellStart"/>
+      <w:r>
+        <w:t>hệt</w:t>
+      </w:r>
+      <w:proofErr w:type="spellEnd"/>
+      <w:r>
+        <w:t xml:space="preserve"> </w:t>
+      </w:r>
+      <w:proofErr w:type="spellStart"/>
+      <w:r>
+        <w:t>như</w:t>
+      </w:r>
+      <w:proofErr w:type="spellEnd"/>
+      <w:r>
+        <w:t xml:space="preserve"> </w:t>
+      </w:r>
+      <w:proofErr w:type="spellStart"/>
+      <w:r>
+        <w:t>cuối</w:t>
+      </w:r>
+      <w:proofErr w:type="spellEnd"/>
+      <w:r>
+        <w:t xml:space="preserve"> </w:t>
+      </w:r>
+      <w:proofErr w:type="spellStart"/>
+      <w:r>
+        <w:t>bài</w:t>
+      </w:r>
+      <w:proofErr w:type="spellEnd"/>
+      <w:r>
+        <w:t>.</w:t>
+      </w:r>
+      <w:r>
+        <w:br/>
+      </w:r>
+    </w:p>
+    <w:p/>
+    <w:p/>
+    <w:p/>
+    <w:p/>
+    <w:p/>
+    <w:p>
+      <w:pPr>
+        <w:rPr>
+          <w:b/>
+          <w:bCs/>
+          <w:color w:val="00B050"/>
+        </w:rPr>
+      </w:pPr>
+    </w:p>
+    <w:p>
+      <w:pPr>
+        <w:rPr>
+          <w:b/>
+          <w:bCs/>
+          <w:color w:val="00B050"/>
+        </w:rPr>
+      </w:pPr>
+    </w:p>
+    <w:p>
+      <w:pPr>
+        <w:rPr>
+          <w:b/>
+          <w:bCs/>
+          <w:color w:val="00B050"/>
+        </w:rPr>
+      </w:pPr>
+    </w:p>
+    <w:p>
+      <w:pPr>
+        <w:rPr>
+          <w:b/>
+          <w:bCs/>
+          <w:color w:val="00B050"/>
+        </w:rPr>
+      </w:pPr>
+    </w:p>
+    <w:p>
+      <w:pPr>
+        <w:rPr>
+          <w:b/>
+          <w:bCs/>
+          <w:color w:val="00B050"/>
+        </w:rPr>
+      </w:pPr>
+    </w:p>
+    <w:p>
+      <w:pPr>
+        <w:pStyle w:val="Heading2"/>
+      </w:pPr>
+      <w:r>
+        <w:t>Circular Dependencies</w:t>
+      </w:r>
+    </w:p>
+    <w:p>
+      <w:proofErr w:type="spellStart"/>
+      <w:r>
+        <w:t>Trước</w:t>
+      </w:r>
+      <w:proofErr w:type="spellEnd"/>
+      <w:r>
+        <w:t xml:space="preserve"> </w:t>
+      </w:r>
+      <w:proofErr w:type="spellStart"/>
+      <w:r>
+        <w:t>mắt</w:t>
+      </w:r>
+      <w:proofErr w:type="spellEnd"/>
+      <w:r>
+        <w:t xml:space="preserve"> </w:t>
+      </w:r>
+      <w:proofErr w:type="spellStart"/>
+      <w:r>
+        <w:t>thì</w:t>
+      </w:r>
+      <w:proofErr w:type="spellEnd"/>
+      <w:r>
+        <w:t xml:space="preserve"> EA Build </w:t>
+      </w:r>
+      <w:proofErr w:type="spellStart"/>
+      <w:r>
+        <w:t>được</w:t>
+      </w:r>
+      <w:proofErr w:type="spellEnd"/>
+    </w:p>
+    <w:p>
+      <w:pPr>
+        <w:pStyle w:val="Heading2"/>
+      </w:pPr>
+      <w:proofErr w:type="spellStart"/>
+      <w:r>
+        <w:t>Kết</w:t>
+      </w:r>
+      <w:proofErr w:type="spellEnd"/>
+      <w:r>
+        <w:t xml:space="preserve"> </w:t>
+      </w:r>
+      <w:proofErr w:type="spellStart"/>
+      <w:r>
+        <w:t>quả</w:t>
+      </w:r>
+      <w:proofErr w:type="spellEnd"/>
+      <w:r>
+        <w:t xml:space="preserve"> </w:t>
+      </w:r>
+      <w:proofErr w:type="spellStart"/>
+      <w:r>
+        <w:t>đạt</w:t>
+      </w:r>
+      <w:proofErr w:type="spellEnd"/>
+      <w:r>
+        <w:t xml:space="preserve"> </w:t>
+      </w:r>
+      <w:proofErr w:type="spellStart"/>
+      <w:r>
+        <w:t>được</w:t>
+      </w:r>
+      <w:proofErr w:type="spellEnd"/>
+      <w:r>
+        <w:t>.</w:t>
+      </w:r>
+    </w:p>
+    <w:p>
+      <w:r>
+        <w:rPr>
+          <w:noProof/>
+        </w:rPr>
+        <w:drawing>
+          <wp:anchor distT="0" distB="0" distL="114300" distR="114300" simplePos="0" relativeHeight="251659264" behindDoc="1" locked="0" layoutInCell="1" allowOverlap="1" wp14:anchorId="00012812" wp14:editId="656DE77A">
+            <wp:simplePos x="0" y="0"/>
+            <wp:positionH relativeFrom="margin">
+              <wp:align>right</wp:align>
+            </wp:positionH>
+            <wp:positionV relativeFrom="paragraph">
+              <wp:posOffset>295910</wp:posOffset>
+            </wp:positionV>
+            <wp:extent cx="5943600" cy="3192145"/>
+            <wp:effectExtent l="0" t="0" r="0" b="8255"/>
+            <wp:wrapNone/>
+            <wp:docPr id="978060069" name="Picture 1"/>
+            <wp:cNvGraphicFramePr>
+              <a:graphicFrameLocks xmlns:a="http://schemas.openxmlformats.org/drawingml/2006/main" noChangeAspect="1"/>
+            </wp:cNvGraphicFramePr>
+            <a:graphic xmlns:a="http://schemas.openxmlformats.org/drawingml/2006/main">
+              <a:graphicData uri="http://schemas.openxmlformats.org/drawingml/2006/picture">
+                <pic:pic xmlns:pic="http://schemas.openxmlformats.org/drawingml/2006/picture">
+                  <pic:nvPicPr>
+                    <pic:cNvPr id="978060069" name=""/>
+                    <pic:cNvPicPr/>
+                  </pic:nvPicPr>
+                  <pic:blipFill>
+                    <a:blip r:embed="rId9" cstate="print">
+                      <a:extLst>
+                        <a:ext uri="{28A0092B-C50C-407E-A947-70E740481C1C}">
+                          <a14:useLocalDpi xmlns:a14="http://schemas.microsoft.com/office/drawing/2010/main" val="0"/>
+                        </a:ext>
+                      </a:extLst>
+                    </a:blip>
+                    <a:stretch>
+                      <a:fillRect/>
+                    </a:stretch>
+                  </pic:blipFill>
+                  <pic:spPr>
+                    <a:xfrm>
+                      <a:off x="0" y="0"/>
+                      <a:ext cx="5943600" cy="3192145"/>
+                    </a:xfrm>
+                    <a:prstGeom prst="rect">
+                      <a:avLst/>
+                    </a:prstGeom>
+                  </pic:spPr>
+                </pic:pic>
+              </a:graphicData>
+            </a:graphic>
+          </wp:anchor>
+        </w:drawing>
+      </w:r>
+      <w:r>
+        <w:t xml:space="preserve">EA Build </w:t>
+      </w:r>
+      <w:proofErr w:type="spellStart"/>
+      <w:r>
+        <w:t>không</w:t>
+      </w:r>
+      <w:proofErr w:type="spellEnd"/>
+      <w:r>
+        <w:t xml:space="preserve"> </w:t>
+      </w:r>
+      <w:proofErr w:type="spellStart"/>
+      <w:r>
+        <w:t>lỗi</w:t>
+      </w:r>
+      <w:proofErr w:type="spellEnd"/>
+      <w:r>
+        <w:t xml:space="preserve"> </w:t>
+      </w:r>
+      <w:proofErr w:type="spellStart"/>
+      <w:r>
+        <w:t>tuy</w:t>
+      </w:r>
+      <w:proofErr w:type="spellEnd"/>
+      <w:r>
+        <w:t xml:space="preserve"> </w:t>
+      </w:r>
+      <w:proofErr w:type="spellStart"/>
+      <w:r>
+        <w:t>nhiên</w:t>
+      </w:r>
+      <w:proofErr w:type="spellEnd"/>
+      <w:r>
+        <w:t xml:space="preserve"> </w:t>
+      </w:r>
+      <w:proofErr w:type="spellStart"/>
+      <w:r>
+        <w:t>giao</w:t>
+      </w:r>
+      <w:proofErr w:type="spellEnd"/>
+      <w:r>
+        <w:t xml:space="preserve"> </w:t>
+      </w:r>
+      <w:proofErr w:type="spellStart"/>
+      <w:r>
+        <w:t>diện</w:t>
+      </w:r>
+      <w:proofErr w:type="spellEnd"/>
+      <w:r>
+        <w:t xml:space="preserve"> </w:t>
+      </w:r>
+      <w:proofErr w:type="spellStart"/>
+      <w:r>
+        <w:t>hiển</w:t>
+      </w:r>
+      <w:proofErr w:type="spellEnd"/>
+      <w:r>
+        <w:t xml:space="preserve"> </w:t>
+      </w:r>
+      <w:proofErr w:type="spellStart"/>
+      <w:r>
+        <w:t>thị</w:t>
+      </w:r>
+      <w:proofErr w:type="spellEnd"/>
+      <w:r>
+        <w:t xml:space="preserve"> </w:t>
+      </w:r>
+      <w:proofErr w:type="spellStart"/>
+      <w:r>
+        <w:t>chưa</w:t>
+      </w:r>
+      <w:proofErr w:type="spellEnd"/>
+      <w:r>
+        <w:t xml:space="preserve"> </w:t>
+      </w:r>
+      <w:proofErr w:type="spellStart"/>
+      <w:r>
+        <w:t>đúng</w:t>
+      </w:r>
+      <w:proofErr w:type="spellEnd"/>
+      <w:r>
+        <w:t>.</w:t>
+      </w:r>
+      <w:r>
+        <w:br/>
+      </w:r>
+    </w:p>
+    <w:p/>
+    <w:p/>
+    <w:p/>
     <w:p/>
     <w:p/>
     <w:sectPr>

</xml_diff>

<commit_message>
Continue refactor MVC //|                           https://www.mql5.com/en/articles/19288 |
</commit_message>
<xml_diff>
--- a/Experts/Anhnt/Document/MQL5 Note/2026 0407 MVC Library.docx
+++ b/Experts/Anhnt/Document/MQL5 Note/2026 0407 MVC Library.docx
@@ -151,8 +151,13 @@
       </w:r>
     </w:p>
     <w:p>
-      <w:r>
-        <w:t>Series : Service Function.</w:t>
+      <w:proofErr w:type="gramStart"/>
+      <w:r>
+        <w:t>Series :</w:t>
+      </w:r>
+      <w:proofErr w:type="gramEnd"/>
+      <w:r>
+        <w:t xml:space="preserve"> Service Function.</w:t>
       </w:r>
     </w:p>
     <w:p>
@@ -261,8 +266,13 @@
         <w:ind w:left="720"/>
       </w:pPr>
       <w:r>
-        <w:t>2. 17960 Base graphical element</w:t>
-      </w:r>
+        <w:t xml:space="preserve">2. 17960 Base graphical </w:t>
+      </w:r>
+      <w:proofErr w:type="gramStart"/>
+      <w:r>
+        <w:t>element</w:t>
+      </w:r>
+      <w:proofErr w:type="gramEnd"/>
     </w:p>
     <w:p>
       <w:pPr>
@@ -466,10 +476,18 @@
       </w:r>
       <w:proofErr w:type="spellEnd"/>
       <w:r>
-        <w:t xml:space="preserve"> 8</w:t>
-      </w:r>
-      <w:r>
-        <w:t xml:space="preserve">.Code </w:t>
+        <w:t xml:space="preserve"> </w:t>
+      </w:r>
+      <w:proofErr w:type="gramStart"/>
+      <w:r>
+        <w:t>8</w:t>
+      </w:r>
+      <w:r>
+        <w:t>.Code</w:t>
+      </w:r>
+      <w:proofErr w:type="gramEnd"/>
+      <w:r>
+        <w:t xml:space="preserve"> </w:t>
       </w:r>
       <w:proofErr w:type="spellStart"/>
       <w:r>
@@ -735,6 +753,7 @@
         </w:numPr>
       </w:pPr>
       <w:proofErr w:type="spellStart"/>
+      <w:proofErr w:type="gramStart"/>
       <w:r>
         <w:t>EA</w:t>
       </w:r>
@@ -748,6 +767,7 @@
       <w:r>
         <w:t>#include</w:t>
       </w:r>
+      <w:proofErr w:type="gramEnd"/>
       <w:r>
         <w:t xml:space="preserve"> </w:t>
       </w:r>
@@ -766,12 +786,17 @@
         </w:numPr>
       </w:pPr>
       <w:proofErr w:type="spellStart"/>
+      <w:proofErr w:type="gramStart"/>
       <w:r>
         <w:t>Control.mqh</w:t>
       </w:r>
       <w:proofErr w:type="spellEnd"/>
       <w:r>
-        <w:t xml:space="preserve">: #include </w:t>
+        <w:t>: #include</w:t>
+      </w:r>
+      <w:proofErr w:type="gramEnd"/>
+      <w:r>
+        <w:t xml:space="preserve"> </w:t>
       </w:r>
       <w:proofErr w:type="spellStart"/>
       <w:r>
@@ -788,12 +813,17 @@
         </w:numPr>
       </w:pPr>
       <w:proofErr w:type="spellStart"/>
+      <w:proofErr w:type="gramStart"/>
       <w:r>
         <w:t>Base.mqh</w:t>
       </w:r>
       <w:proofErr w:type="spellEnd"/>
       <w:r>
-        <w:t xml:space="preserve">: #include </w:t>
+        <w:t>: #include</w:t>
+      </w:r>
+      <w:proofErr w:type="gramEnd"/>
+      <w:r>
+        <w:t xml:space="preserve"> </w:t>
       </w:r>
       <w:proofErr w:type="spellStart"/>
       <w:r>
@@ -12486,6 +12516,139 @@
         </w:tc>
       </w:tr>
     </w:tbl>
+    <w:p/>
+    <w:p>
+      <w:pPr>
+        <w:pStyle w:val="Heading2"/>
+        <w:sectPr>
+          <w:pgSz w:w="12240" w:h="15840"/>
+          <w:pgMar w:top="1440" w:right="1440" w:bottom="1440" w:left="1440" w:header="708" w:footer="708" w:gutter="0"/>
+          <w:cols w:space="708"/>
+          <w:docGrid w:linePitch="360"/>
+        </w:sectPr>
+      </w:pPr>
+    </w:p>
+    <w:p>
+      <w:pPr>
+        <w:pStyle w:val="Heading2"/>
+      </w:pPr>
+      <w:proofErr w:type="spellStart"/>
+      <w:r>
+        <w:lastRenderedPageBreak/>
+        <w:t>Thứ</w:t>
+      </w:r>
+      <w:proofErr w:type="spellEnd"/>
+      <w:r>
+        <w:t xml:space="preserve"> </w:t>
+      </w:r>
+      <w:proofErr w:type="spellStart"/>
+      <w:r>
+        <w:t>tự</w:t>
+      </w:r>
+      <w:proofErr w:type="spellEnd"/>
+      <w:r>
+        <w:t xml:space="preserve"> </w:t>
+      </w:r>
+      <w:proofErr w:type="spellStart"/>
+      <w:r>
+        <w:t>các</w:t>
+      </w:r>
+      <w:proofErr w:type="spellEnd"/>
+      <w:r>
+        <w:t xml:space="preserve"> class </w:t>
+      </w:r>
+      <w:proofErr w:type="spellStart"/>
+      <w:r>
+        <w:t>trước</w:t>
+      </w:r>
+      <w:proofErr w:type="spellEnd"/>
+      <w:r>
+        <w:t xml:space="preserve"> khi tách</w:t>
+      </w:r>
+    </w:p>
+    <w:p>
+      <w:r>
+        <w:rPr>
+          <w:noProof/>
+        </w:rPr>
+        <w:drawing>
+          <wp:anchor distT="0" distB="0" distL="114300" distR="114300" simplePos="0" relativeHeight="251660288" behindDoc="1" locked="0" layoutInCell="1" allowOverlap="1" wp14:anchorId="58353D32" wp14:editId="1DFAED28">
+            <wp:simplePos x="0" y="0"/>
+            <wp:positionH relativeFrom="margin">
+              <wp:align>right</wp:align>
+            </wp:positionH>
+            <wp:positionV relativeFrom="paragraph">
+              <wp:posOffset>33746</wp:posOffset>
+            </wp:positionV>
+            <wp:extent cx="5943600" cy="5556885"/>
+            <wp:effectExtent l="0" t="0" r="0" b="5715"/>
+            <wp:wrapNone/>
+            <wp:docPr id="109014211" name="Picture 1"/>
+            <wp:cNvGraphicFramePr>
+              <a:graphicFrameLocks xmlns:a="http://schemas.openxmlformats.org/drawingml/2006/main" noChangeAspect="1"/>
+            </wp:cNvGraphicFramePr>
+            <a:graphic xmlns:a="http://schemas.openxmlformats.org/drawingml/2006/main">
+              <a:graphicData uri="http://schemas.openxmlformats.org/drawingml/2006/picture">
+                <pic:pic xmlns:pic="http://schemas.openxmlformats.org/drawingml/2006/picture">
+                  <pic:nvPicPr>
+                    <pic:cNvPr id="109014211" name=""/>
+                    <pic:cNvPicPr/>
+                  </pic:nvPicPr>
+                  <pic:blipFill>
+                    <a:blip r:embed="rId8">
+                      <a:extLst>
+                        <a:ext uri="{28A0092B-C50C-407E-A947-70E740481C1C}">
+                          <a14:useLocalDpi xmlns:a14="http://schemas.microsoft.com/office/drawing/2010/main" val="0"/>
+                        </a:ext>
+                      </a:extLst>
+                    </a:blip>
+                    <a:stretch>
+                      <a:fillRect/>
+                    </a:stretch>
+                  </pic:blipFill>
+                  <pic:spPr>
+                    <a:xfrm>
+                      <a:off x="0" y="0"/>
+                      <a:ext cx="5943600" cy="5556885"/>
+                    </a:xfrm>
+                    <a:prstGeom prst="rect">
+                      <a:avLst/>
+                    </a:prstGeom>
+                  </pic:spPr>
+                </pic:pic>
+              </a:graphicData>
+            </a:graphic>
+          </wp:anchor>
+        </w:drawing>
+      </w:r>
+    </w:p>
+    <w:p/>
+    <w:p/>
+    <w:p/>
+    <w:p/>
+    <w:p/>
+    <w:p/>
+    <w:p/>
+    <w:p/>
+    <w:p/>
+    <w:p/>
+    <w:p/>
+    <w:p/>
+    <w:p/>
+    <w:p/>
+    <w:p/>
+    <w:p/>
+    <w:p/>
+    <w:p>
+      <w:pPr>
+        <w:pStyle w:val="Heading2"/>
+      </w:pPr>
+      <w:proofErr w:type="spellStart"/>
+      <w:r>
+        <w:t>CScrollBarV</w:t>
+      </w:r>
+      <w:proofErr w:type="spellEnd"/>
+    </w:p>
     <w:p/>
     <w:p>
       <w:pPr>
@@ -12688,7 +12851,7 @@
                     <pic:cNvPicPr/>
                   </pic:nvPicPr>
                   <pic:blipFill>
-                    <a:blip r:embed="rId8" cstate="print">
+                    <a:blip r:embed="rId9" cstate="print">
                       <a:extLst>
                         <a:ext uri="{28A0092B-C50C-407E-A947-70E740481C1C}">
                           <a14:useLocalDpi xmlns:a14="http://schemas.microsoft.com/office/drawing/2010/main" val="0"/>
@@ -12883,40 +13046,310 @@
         <w:pStyle w:val="Heading2"/>
       </w:pPr>
       <w:r>
-        <w:t>Circular Dependencies</w:t>
-      </w:r>
+        <w:t xml:space="preserve">Nguyên </w:t>
+      </w:r>
+      <w:proofErr w:type="spellStart"/>
+      <w:r>
+        <w:t>tắc</w:t>
+      </w:r>
+      <w:proofErr w:type="spellEnd"/>
     </w:p>
     <w:p>
-      <w:proofErr w:type="spellStart"/>
-      <w:r>
-        <w:t>Trước</w:t>
-      </w:r>
-      <w:proofErr w:type="spellEnd"/>
-      <w:r>
+      <w:r>
+        <w:rPr>
+          <w:b/>
+          <w:bCs/>
+        </w:rPr>
+        <w:t>Các file .</w:t>
+      </w:r>
+      <w:proofErr w:type="spellStart"/>
+      <w:r>
+        <w:rPr>
+          <w:b/>
+          <w:bCs/>
+        </w:rPr>
+        <w:t>mqh</w:t>
+      </w:r>
+      <w:proofErr w:type="spellEnd"/>
+      <w:r>
+        <w:rPr>
+          <w:b/>
+          <w:bCs/>
+        </w:rPr>
         <w:t xml:space="preserve"> </w:t>
       </w:r>
       <w:proofErr w:type="spellStart"/>
       <w:r>
-        <w:t>mắt</w:t>
-      </w:r>
-      <w:proofErr w:type="spellEnd"/>
-      <w:r>
+        <w:rPr>
+          <w:b/>
+          <w:bCs/>
+        </w:rPr>
+        <w:t>riêng</w:t>
+      </w:r>
+      <w:proofErr w:type="spellEnd"/>
+      <w:r>
+        <w:rPr>
+          <w:b/>
+          <w:bCs/>
+        </w:rPr>
         <w:t xml:space="preserve"> </w:t>
       </w:r>
       <w:proofErr w:type="spellStart"/>
       <w:r>
-        <w:t>thì</w:t>
-      </w:r>
-      <w:proofErr w:type="spellEnd"/>
-      <w:r>
-        <w:t xml:space="preserve"> EA Build </w:t>
-      </w:r>
-      <w:proofErr w:type="spellStart"/>
-      <w:r>
-        <w:t>được</w:t>
-      </w:r>
-      <w:proofErr w:type="spellEnd"/>
+        <w:rPr>
+          <w:b/>
+          <w:bCs/>
+        </w:rPr>
+        <w:t>lẻ</w:t>
+      </w:r>
+      <w:proofErr w:type="spellEnd"/>
+      <w:r>
+        <w:t xml:space="preserve"> chỉ </w:t>
+      </w:r>
+      <w:proofErr w:type="spellStart"/>
+      <w:r>
+        <w:t>chứa</w:t>
+      </w:r>
+      <w:proofErr w:type="spellEnd"/>
+      <w:r>
+        <w:t>:</w:t>
+      </w:r>
     </w:p>
+    <w:p>
+      <w:pPr>
+        <w:numPr>
+          <w:ilvl w:val="0"/>
+          <w:numId w:val="3"/>
+        </w:numPr>
+      </w:pPr>
+      <w:r>
+        <w:t>Class declaration</w:t>
+      </w:r>
+    </w:p>
+    <w:p>
+      <w:pPr>
+        <w:numPr>
+          <w:ilvl w:val="0"/>
+          <w:numId w:val="3"/>
+        </w:numPr>
+      </w:pPr>
+      <w:r>
+        <w:t>Method signatures</w:t>
+      </w:r>
+    </w:p>
+    <w:p>
+      <w:pPr>
+        <w:numPr>
+          <w:ilvl w:val="0"/>
+          <w:numId w:val="3"/>
+        </w:numPr>
+      </w:pPr>
+      <w:r>
+        <w:t xml:space="preserve">Inline methods </w:t>
+      </w:r>
+      <w:proofErr w:type="spellStart"/>
+      <w:r>
+        <w:t>đơn</w:t>
+      </w:r>
+      <w:proofErr w:type="spellEnd"/>
+      <w:r>
+        <w:t xml:space="preserve"> </w:t>
+      </w:r>
+      <w:proofErr w:type="spellStart"/>
+      <w:r>
+        <w:t>giản</w:t>
+      </w:r>
+      <w:proofErr w:type="spellEnd"/>
+      <w:r>
+        <w:t xml:space="preserve"> (</w:t>
+      </w:r>
+      <w:proofErr w:type="spellStart"/>
+      <w:r>
+        <w:t>không</w:t>
+      </w:r>
+      <w:proofErr w:type="spellEnd"/>
+      <w:r>
+        <w:t xml:space="preserve"> </w:t>
+      </w:r>
+      <w:proofErr w:type="spellStart"/>
+      <w:r>
+        <w:t>cần</w:t>
+      </w:r>
+      <w:proofErr w:type="spellEnd"/>
+      <w:r>
+        <w:t xml:space="preserve"> full type </w:t>
+      </w:r>
+      <w:proofErr w:type="spellStart"/>
+      <w:r>
+        <w:t>của</w:t>
+      </w:r>
+      <w:proofErr w:type="spellEnd"/>
+      <w:r>
+        <w:t xml:space="preserve"> class </w:t>
+      </w:r>
+      <w:proofErr w:type="spellStart"/>
+      <w:r>
+        <w:t>khác</w:t>
+      </w:r>
+      <w:proofErr w:type="spellEnd"/>
+      <w:r>
+        <w:t>)</w:t>
+      </w:r>
+    </w:p>
+    <w:p>
+      <w:proofErr w:type="spellStart"/>
+      <w:r>
+        <w:rPr>
+          <w:b/>
+          <w:bCs/>
+        </w:rPr>
+        <w:t>DELib.mqh</w:t>
+      </w:r>
+      <w:proofErr w:type="spellEnd"/>
+      <w:r>
+        <w:t xml:space="preserve"> </w:t>
+      </w:r>
+      <w:proofErr w:type="spellStart"/>
+      <w:r>
+        <w:t>chứa</w:t>
+      </w:r>
+      <w:proofErr w:type="spellEnd"/>
+      <w:r>
+        <w:t>:</w:t>
+      </w:r>
+    </w:p>
+    <w:p>
+      <w:pPr>
+        <w:numPr>
+          <w:ilvl w:val="0"/>
+          <w:numId w:val="4"/>
+        </w:numPr>
+      </w:pPr>
+      <w:r>
+        <w:t xml:space="preserve">Include </w:t>
+      </w:r>
+      <w:proofErr w:type="spellStart"/>
+      <w:r>
+        <w:t>tất</w:t>
+      </w:r>
+      <w:proofErr w:type="spellEnd"/>
+      <w:r>
+        <w:t xml:space="preserve"> </w:t>
+      </w:r>
+      <w:proofErr w:type="spellStart"/>
+      <w:r>
+        <w:t>cả</w:t>
+      </w:r>
+      <w:proofErr w:type="spellEnd"/>
+      <w:r>
+        <w:t xml:space="preserve"> </w:t>
+      </w:r>
+      <w:proofErr w:type="spellStart"/>
+      <w:r>
+        <w:t>các</w:t>
+      </w:r>
+      <w:proofErr w:type="spellEnd"/>
+      <w:r>
+        <w:t xml:space="preserve"> file </w:t>
+      </w:r>
+      <w:proofErr w:type="spellStart"/>
+      <w:r>
+        <w:t>theo</w:t>
+      </w:r>
+      <w:proofErr w:type="spellEnd"/>
+      <w:r>
+        <w:t xml:space="preserve"> </w:t>
+      </w:r>
+      <w:proofErr w:type="spellStart"/>
+      <w:r>
+        <w:t>đúng</w:t>
+      </w:r>
+      <w:proofErr w:type="spellEnd"/>
+      <w:r>
+        <w:t xml:space="preserve"> </w:t>
+      </w:r>
+      <w:proofErr w:type="spellStart"/>
+      <w:r>
+        <w:t>thứ</w:t>
+      </w:r>
+      <w:proofErr w:type="spellEnd"/>
+      <w:r>
+        <w:t xml:space="preserve"> </w:t>
+      </w:r>
+      <w:proofErr w:type="spellStart"/>
+      <w:r>
+        <w:t>tự</w:t>
+      </w:r>
+      <w:proofErr w:type="spellEnd"/>
+      <w:r>
+        <w:t xml:space="preserve"> dependency</w:t>
+      </w:r>
+    </w:p>
+    <w:p>
+      <w:pPr>
+        <w:numPr>
+          <w:ilvl w:val="0"/>
+          <w:numId w:val="4"/>
+        </w:numPr>
+      </w:pPr>
+      <w:proofErr w:type="spellStart"/>
+      <w:r>
+        <w:t>Toàn</w:t>
+      </w:r>
+      <w:proofErr w:type="spellEnd"/>
+      <w:r>
+        <w:t xml:space="preserve"> </w:t>
+      </w:r>
+      <w:proofErr w:type="spellStart"/>
+      <w:r>
+        <w:t>bộ</w:t>
+      </w:r>
+      <w:proofErr w:type="spellEnd"/>
+      <w:r>
+        <w:t xml:space="preserve"> implementations </w:t>
+      </w:r>
+      <w:proofErr w:type="spellStart"/>
+      <w:r>
+        <w:t>của</w:t>
+      </w:r>
+      <w:proofErr w:type="spellEnd"/>
+      <w:r>
+        <w:t xml:space="preserve"> </w:t>
+      </w:r>
+      <w:proofErr w:type="spellStart"/>
+      <w:r>
+        <w:t>các</w:t>
+      </w:r>
+      <w:proofErr w:type="spellEnd"/>
+      <w:r>
+        <w:t xml:space="preserve"> method </w:t>
+      </w:r>
+      <w:proofErr w:type="spellStart"/>
+      <w:r>
+        <w:t>phức</w:t>
+      </w:r>
+      <w:proofErr w:type="spellEnd"/>
+      <w:r>
+        <w:t xml:space="preserve"> </w:t>
+      </w:r>
+      <w:proofErr w:type="spellStart"/>
+      <w:r>
+        <w:t>tạp</w:t>
+      </w:r>
+      <w:proofErr w:type="spellEnd"/>
+      <w:r>
+        <w:t xml:space="preserve"> (</w:t>
+      </w:r>
+      <w:proofErr w:type="spellStart"/>
+      <w:r>
+        <w:t>cần</w:t>
+      </w:r>
+      <w:proofErr w:type="spellEnd"/>
+      <w:r>
+        <w:t xml:space="preserve"> cross-class)</w:t>
+      </w:r>
+    </w:p>
+    <w:p/>
     <w:p>
       <w:pPr>
         <w:pStyle w:val="Heading2"/>
@@ -12960,7 +13393,7 @@
           <w:noProof/>
         </w:rPr>
         <w:drawing>
-          <wp:anchor distT="0" distB="0" distL="114300" distR="114300" simplePos="0" relativeHeight="251659264" behindDoc="1" locked="0" layoutInCell="1" allowOverlap="1" wp14:anchorId="00012812" wp14:editId="656DE77A">
+          <wp:anchor distT="0" distB="0" distL="114300" distR="114300" simplePos="0" relativeHeight="251659264" behindDoc="1" locked="0" layoutInCell="1" allowOverlap="1" wp14:anchorId="00012812" wp14:editId="206E8D43">
             <wp:simplePos x="0" y="0"/>
             <wp:positionH relativeFrom="margin">
               <wp:align>right</wp:align>
@@ -12983,7 +13416,7 @@
                     <pic:cNvPicPr/>
                   </pic:nvPicPr>
                   <pic:blipFill>
-                    <a:blip r:embed="rId9" cstate="print">
+                    <a:blip r:embed="rId10" cstate="print">
                       <a:extLst>
                         <a:ext uri="{28A0092B-C50C-407E-A947-70E740481C1C}">
                           <a14:useLocalDpi xmlns:a14="http://schemas.microsoft.com/office/drawing/2010/main" val="0"/>
@@ -13082,15 +13515,7 @@
       </w:r>
       <w:proofErr w:type="spellEnd"/>
       <w:r>
-        <w:t xml:space="preserve"> </w:t>
-      </w:r>
-      <w:proofErr w:type="spellStart"/>
-      <w:r>
-        <w:t>đúng</w:t>
-      </w:r>
-      <w:proofErr w:type="spellEnd"/>
-      <w:r>
-        <w:t>.</w:t>
+        <w:t xml:space="preserve"> đúng.</w:t>
       </w:r>
       <w:r>
         <w:br/>
@@ -13291,11 +13716,315 @@
       </w:pPr>
     </w:lvl>
   </w:abstractNum>
+  <w:abstractNum w:abstractNumId="2" w15:restartNumberingAfterBreak="0">
+    <w:nsid w:val="2FB157E2"/>
+    <w:multiLevelType w:val="multilevel"/>
+    <w:tmpl w:val="7272189A"/>
+    <w:lvl w:ilvl="0">
+      <w:start w:val="1"/>
+      <w:numFmt w:val="bullet"/>
+      <w:lvlText w:val=""/>
+      <w:lvlJc w:val="left"/>
+      <w:pPr>
+        <w:tabs>
+          <w:tab w:val="num" w:pos="720"/>
+        </w:tabs>
+        <w:ind w:left="720" w:hanging="360"/>
+      </w:pPr>
+      <w:rPr>
+        <w:rFonts w:ascii="Symbol" w:hAnsi="Symbol" w:hint="default"/>
+        <w:sz w:val="20"/>
+      </w:rPr>
+    </w:lvl>
+    <w:lvl w:ilvl="1" w:tentative="1">
+      <w:start w:val="1"/>
+      <w:numFmt w:val="bullet"/>
+      <w:lvlText w:val="o"/>
+      <w:lvlJc w:val="left"/>
+      <w:pPr>
+        <w:tabs>
+          <w:tab w:val="num" w:pos="1440"/>
+        </w:tabs>
+        <w:ind w:left="1440" w:hanging="360"/>
+      </w:pPr>
+      <w:rPr>
+        <w:rFonts w:ascii="Courier New" w:hAnsi="Courier New" w:hint="default"/>
+        <w:sz w:val="20"/>
+      </w:rPr>
+    </w:lvl>
+    <w:lvl w:ilvl="2" w:tentative="1">
+      <w:start w:val="1"/>
+      <w:numFmt w:val="bullet"/>
+      <w:lvlText w:val=""/>
+      <w:lvlJc w:val="left"/>
+      <w:pPr>
+        <w:tabs>
+          <w:tab w:val="num" w:pos="2160"/>
+        </w:tabs>
+        <w:ind w:left="2160" w:hanging="360"/>
+      </w:pPr>
+      <w:rPr>
+        <w:rFonts w:ascii="Wingdings" w:hAnsi="Wingdings" w:hint="default"/>
+        <w:sz w:val="20"/>
+      </w:rPr>
+    </w:lvl>
+    <w:lvl w:ilvl="3" w:tentative="1">
+      <w:start w:val="1"/>
+      <w:numFmt w:val="bullet"/>
+      <w:lvlText w:val=""/>
+      <w:lvlJc w:val="left"/>
+      <w:pPr>
+        <w:tabs>
+          <w:tab w:val="num" w:pos="2880"/>
+        </w:tabs>
+        <w:ind w:left="2880" w:hanging="360"/>
+      </w:pPr>
+      <w:rPr>
+        <w:rFonts w:ascii="Wingdings" w:hAnsi="Wingdings" w:hint="default"/>
+        <w:sz w:val="20"/>
+      </w:rPr>
+    </w:lvl>
+    <w:lvl w:ilvl="4" w:tentative="1">
+      <w:start w:val="1"/>
+      <w:numFmt w:val="bullet"/>
+      <w:lvlText w:val=""/>
+      <w:lvlJc w:val="left"/>
+      <w:pPr>
+        <w:tabs>
+          <w:tab w:val="num" w:pos="3600"/>
+        </w:tabs>
+        <w:ind w:left="3600" w:hanging="360"/>
+      </w:pPr>
+      <w:rPr>
+        <w:rFonts w:ascii="Wingdings" w:hAnsi="Wingdings" w:hint="default"/>
+        <w:sz w:val="20"/>
+      </w:rPr>
+    </w:lvl>
+    <w:lvl w:ilvl="5" w:tentative="1">
+      <w:start w:val="1"/>
+      <w:numFmt w:val="bullet"/>
+      <w:lvlText w:val=""/>
+      <w:lvlJc w:val="left"/>
+      <w:pPr>
+        <w:tabs>
+          <w:tab w:val="num" w:pos="4320"/>
+        </w:tabs>
+        <w:ind w:left="4320" w:hanging="360"/>
+      </w:pPr>
+      <w:rPr>
+        <w:rFonts w:ascii="Wingdings" w:hAnsi="Wingdings" w:hint="default"/>
+        <w:sz w:val="20"/>
+      </w:rPr>
+    </w:lvl>
+    <w:lvl w:ilvl="6" w:tentative="1">
+      <w:start w:val="1"/>
+      <w:numFmt w:val="bullet"/>
+      <w:lvlText w:val=""/>
+      <w:lvlJc w:val="left"/>
+      <w:pPr>
+        <w:tabs>
+          <w:tab w:val="num" w:pos="5040"/>
+        </w:tabs>
+        <w:ind w:left="5040" w:hanging="360"/>
+      </w:pPr>
+      <w:rPr>
+        <w:rFonts w:ascii="Wingdings" w:hAnsi="Wingdings" w:hint="default"/>
+        <w:sz w:val="20"/>
+      </w:rPr>
+    </w:lvl>
+    <w:lvl w:ilvl="7" w:tentative="1">
+      <w:start w:val="1"/>
+      <w:numFmt w:val="bullet"/>
+      <w:lvlText w:val=""/>
+      <w:lvlJc w:val="left"/>
+      <w:pPr>
+        <w:tabs>
+          <w:tab w:val="num" w:pos="5760"/>
+        </w:tabs>
+        <w:ind w:left="5760" w:hanging="360"/>
+      </w:pPr>
+      <w:rPr>
+        <w:rFonts w:ascii="Wingdings" w:hAnsi="Wingdings" w:hint="default"/>
+        <w:sz w:val="20"/>
+      </w:rPr>
+    </w:lvl>
+    <w:lvl w:ilvl="8" w:tentative="1">
+      <w:start w:val="1"/>
+      <w:numFmt w:val="bullet"/>
+      <w:lvlText w:val=""/>
+      <w:lvlJc w:val="left"/>
+      <w:pPr>
+        <w:tabs>
+          <w:tab w:val="num" w:pos="6480"/>
+        </w:tabs>
+        <w:ind w:left="6480" w:hanging="360"/>
+      </w:pPr>
+      <w:rPr>
+        <w:rFonts w:ascii="Wingdings" w:hAnsi="Wingdings" w:hint="default"/>
+        <w:sz w:val="20"/>
+      </w:rPr>
+    </w:lvl>
+  </w:abstractNum>
+  <w:abstractNum w:abstractNumId="3" w15:restartNumberingAfterBreak="0">
+    <w:nsid w:val="599D2925"/>
+    <w:multiLevelType w:val="multilevel"/>
+    <w:tmpl w:val="52BEAA1C"/>
+    <w:lvl w:ilvl="0">
+      <w:start w:val="1"/>
+      <w:numFmt w:val="bullet"/>
+      <w:lvlText w:val=""/>
+      <w:lvlJc w:val="left"/>
+      <w:pPr>
+        <w:tabs>
+          <w:tab w:val="num" w:pos="720"/>
+        </w:tabs>
+        <w:ind w:left="720" w:hanging="360"/>
+      </w:pPr>
+      <w:rPr>
+        <w:rFonts w:ascii="Symbol" w:hAnsi="Symbol" w:hint="default"/>
+        <w:sz w:val="20"/>
+      </w:rPr>
+    </w:lvl>
+    <w:lvl w:ilvl="1" w:tentative="1">
+      <w:start w:val="1"/>
+      <w:numFmt w:val="bullet"/>
+      <w:lvlText w:val="o"/>
+      <w:lvlJc w:val="left"/>
+      <w:pPr>
+        <w:tabs>
+          <w:tab w:val="num" w:pos="1440"/>
+        </w:tabs>
+        <w:ind w:left="1440" w:hanging="360"/>
+      </w:pPr>
+      <w:rPr>
+        <w:rFonts w:ascii="Courier New" w:hAnsi="Courier New" w:hint="default"/>
+        <w:sz w:val="20"/>
+      </w:rPr>
+    </w:lvl>
+    <w:lvl w:ilvl="2" w:tentative="1">
+      <w:start w:val="1"/>
+      <w:numFmt w:val="bullet"/>
+      <w:lvlText w:val=""/>
+      <w:lvlJc w:val="left"/>
+      <w:pPr>
+        <w:tabs>
+          <w:tab w:val="num" w:pos="2160"/>
+        </w:tabs>
+        <w:ind w:left="2160" w:hanging="360"/>
+      </w:pPr>
+      <w:rPr>
+        <w:rFonts w:ascii="Wingdings" w:hAnsi="Wingdings" w:hint="default"/>
+        <w:sz w:val="20"/>
+      </w:rPr>
+    </w:lvl>
+    <w:lvl w:ilvl="3" w:tentative="1">
+      <w:start w:val="1"/>
+      <w:numFmt w:val="bullet"/>
+      <w:lvlText w:val=""/>
+      <w:lvlJc w:val="left"/>
+      <w:pPr>
+        <w:tabs>
+          <w:tab w:val="num" w:pos="2880"/>
+        </w:tabs>
+        <w:ind w:left="2880" w:hanging="360"/>
+      </w:pPr>
+      <w:rPr>
+        <w:rFonts w:ascii="Wingdings" w:hAnsi="Wingdings" w:hint="default"/>
+        <w:sz w:val="20"/>
+      </w:rPr>
+    </w:lvl>
+    <w:lvl w:ilvl="4" w:tentative="1">
+      <w:start w:val="1"/>
+      <w:numFmt w:val="bullet"/>
+      <w:lvlText w:val=""/>
+      <w:lvlJc w:val="left"/>
+      <w:pPr>
+        <w:tabs>
+          <w:tab w:val="num" w:pos="3600"/>
+        </w:tabs>
+        <w:ind w:left="3600" w:hanging="360"/>
+      </w:pPr>
+      <w:rPr>
+        <w:rFonts w:ascii="Wingdings" w:hAnsi="Wingdings" w:hint="default"/>
+        <w:sz w:val="20"/>
+      </w:rPr>
+    </w:lvl>
+    <w:lvl w:ilvl="5" w:tentative="1">
+      <w:start w:val="1"/>
+      <w:numFmt w:val="bullet"/>
+      <w:lvlText w:val=""/>
+      <w:lvlJc w:val="left"/>
+      <w:pPr>
+        <w:tabs>
+          <w:tab w:val="num" w:pos="4320"/>
+        </w:tabs>
+        <w:ind w:left="4320" w:hanging="360"/>
+      </w:pPr>
+      <w:rPr>
+        <w:rFonts w:ascii="Wingdings" w:hAnsi="Wingdings" w:hint="default"/>
+        <w:sz w:val="20"/>
+      </w:rPr>
+    </w:lvl>
+    <w:lvl w:ilvl="6" w:tentative="1">
+      <w:start w:val="1"/>
+      <w:numFmt w:val="bullet"/>
+      <w:lvlText w:val=""/>
+      <w:lvlJc w:val="left"/>
+      <w:pPr>
+        <w:tabs>
+          <w:tab w:val="num" w:pos="5040"/>
+        </w:tabs>
+        <w:ind w:left="5040" w:hanging="360"/>
+      </w:pPr>
+      <w:rPr>
+        <w:rFonts w:ascii="Wingdings" w:hAnsi="Wingdings" w:hint="default"/>
+        <w:sz w:val="20"/>
+      </w:rPr>
+    </w:lvl>
+    <w:lvl w:ilvl="7" w:tentative="1">
+      <w:start w:val="1"/>
+      <w:numFmt w:val="bullet"/>
+      <w:lvlText w:val=""/>
+      <w:lvlJc w:val="left"/>
+      <w:pPr>
+        <w:tabs>
+          <w:tab w:val="num" w:pos="5760"/>
+        </w:tabs>
+        <w:ind w:left="5760" w:hanging="360"/>
+      </w:pPr>
+      <w:rPr>
+        <w:rFonts w:ascii="Wingdings" w:hAnsi="Wingdings" w:hint="default"/>
+        <w:sz w:val="20"/>
+      </w:rPr>
+    </w:lvl>
+    <w:lvl w:ilvl="8" w:tentative="1">
+      <w:start w:val="1"/>
+      <w:numFmt w:val="bullet"/>
+      <w:lvlText w:val=""/>
+      <w:lvlJc w:val="left"/>
+      <w:pPr>
+        <w:tabs>
+          <w:tab w:val="num" w:pos="6480"/>
+        </w:tabs>
+        <w:ind w:left="6480" w:hanging="360"/>
+      </w:pPr>
+      <w:rPr>
+        <w:rFonts w:ascii="Wingdings" w:hAnsi="Wingdings" w:hint="default"/>
+        <w:sz w:val="20"/>
+      </w:rPr>
+    </w:lvl>
+  </w:abstractNum>
   <w:num w:numId="1" w16cid:durableId="655305772">
     <w:abstractNumId w:val="1"/>
   </w:num>
   <w:num w:numId="2" w16cid:durableId="1672097226">
     <w:abstractNumId w:val="0"/>
+  </w:num>
+  <w:num w:numId="3" w16cid:durableId="218790642">
+    <w:abstractNumId w:val="2"/>
+  </w:num>
+  <w:num w:numId="4" w16cid:durableId="996686023">
+    <w:abstractNumId w:val="3"/>
   </w:num>
 </w:numbering>
 </file>

</xml_diff>